<commit_message>
results: tuned OT significantly improves GNN student (+0.022~0.025, t~5); update report
</commit_message>
<xml_diff>
--- a/CUTFGWD_Report.docx
+++ b/CUTFGWD_Report.docx
@@ -7,14 +7,14 @@
         <w:rPr>
           <w:rFonts w:ascii="宋体" w:eastAsia="宋体" w:hAnsi="宋体"/>
           <w:b/>
-          <w:sz w:val="36"/>
-        </w:rPr>
-      </w:pPr>
-      <w:r>
-        <w:rPr>
-          <w:rFonts w:ascii="宋体" w:eastAsia="宋体" w:hAnsi="宋体"/>
-          <w:b/>
-          <w:sz w:val="36"/>
+          <w:sz w:val="34"/>
+        </w:rPr>
+      </w:pPr>
+      <w:r>
+        <w:rPr>
+          <w:rFonts w:ascii="宋体" w:eastAsia="宋体" w:hAnsi="宋体"/>
+          <w:b/>
+          <w:sz w:val="34"/>
         </w:rPr>
         <w:t>CUTFGWD 工作总结报告</w:t>
       </w:r>
@@ -23,13 +23,13 @@
       <w:pPr>
         <w:rPr>
           <w:rFonts w:ascii="宋体" w:eastAsia="宋体" w:hAnsi="宋体"/>
-          <w:sz w:val="23"/>
-        </w:rPr>
-      </w:pPr>
-      <w:r>
-        <w:rPr>
-          <w:rFonts w:ascii="宋体" w:eastAsia="宋体" w:hAnsi="宋体"/>
-          <w:sz w:val="23"/>
+          <w:sz w:val="22"/>
+        </w:rPr>
+      </w:pPr>
+      <w:r>
+        <w:rPr>
+          <w:rFonts w:ascii="宋体" w:eastAsia="宋体" w:hAnsi="宋体"/>
+          <w:sz w:val="22"/>
         </w:rPr>
         <w:t>时序图知识蒸馏：动机、方法、实验与可复现清单</w:t>
       </w:r>
@@ -38,23 +38,23 @@
       <w:pPr>
         <w:rPr>
           <w:rFonts w:ascii="宋体" w:eastAsia="宋体" w:hAnsi="宋体"/>
-          <w:sz w:val="23"/>
-        </w:rPr>
-      </w:pPr>
-    </w:p>
-    <w:p>
-      <w:pPr>
-        <w:rPr>
-          <w:rFonts w:ascii="宋体" w:eastAsia="宋体" w:hAnsi="宋体"/>
-          <w:b/>
-          <w:sz w:val="28"/>
-        </w:rPr>
-      </w:pPr>
-      <w:r>
-        <w:rPr>
-          <w:rFonts w:ascii="宋体" w:eastAsia="宋体" w:hAnsi="宋体"/>
-          <w:b/>
-          <w:sz w:val="28"/>
+          <w:sz w:val="22"/>
+        </w:rPr>
+      </w:pPr>
+    </w:p>
+    <w:p>
+      <w:pPr>
+        <w:rPr>
+          <w:rFonts w:ascii="宋体" w:eastAsia="宋体" w:hAnsi="宋体"/>
+          <w:b/>
+          <w:sz w:val="27"/>
+        </w:rPr>
+      </w:pPr>
+      <w:r>
+        <w:rPr>
+          <w:rFonts w:ascii="宋体" w:eastAsia="宋体" w:hAnsi="宋体"/>
+          <w:b/>
+          <w:sz w:val="27"/>
         </w:rPr>
         <w:t>0. 背景与工作范围</w:t>
       </w:r>
@@ -63,13 +63,13 @@
       <w:pPr>
         <w:rPr>
           <w:rFonts w:ascii="宋体" w:eastAsia="宋体" w:hAnsi="宋体"/>
-          <w:sz w:val="23"/>
-        </w:rPr>
-      </w:pPr>
-      <w:r>
-        <w:rPr>
-          <w:rFonts w:ascii="宋体" w:eastAsia="宋体" w:hAnsi="宋体"/>
-          <w:sz w:val="23"/>
+          <w:sz w:val="22"/>
+        </w:rPr>
+      </w:pPr>
+      <w:r>
+        <w:rPr>
+          <w:rFonts w:ascii="宋体" w:eastAsia="宋体" w:hAnsi="宋体"/>
+          <w:sz w:val="22"/>
         </w:rPr>
         <w:t>本文档总结 CUTFGWD（时序图知识蒸馏）方法从代码审查、工程实现到系统实验的全过程，覆盖 17 张实验表。结论以「配对多 seed + 全量官方 val」为口径：先解决评测方差，再判断方法效应。</w:t>
       </w:r>
@@ -78,23 +78,23 @@
       <w:pPr>
         <w:rPr>
           <w:rFonts w:ascii="宋体" w:eastAsia="宋体" w:hAnsi="宋体"/>
-          <w:sz w:val="23"/>
-        </w:rPr>
-      </w:pPr>
-    </w:p>
-    <w:p>
-      <w:pPr>
-        <w:rPr>
-          <w:rFonts w:ascii="宋体" w:eastAsia="宋体" w:hAnsi="宋体"/>
-          <w:b/>
-          <w:sz w:val="28"/>
-        </w:rPr>
-      </w:pPr>
-      <w:r>
-        <w:rPr>
-          <w:rFonts w:ascii="宋体" w:eastAsia="宋体" w:hAnsi="宋体"/>
-          <w:b/>
-          <w:sz w:val="28"/>
+          <w:sz w:val="22"/>
+        </w:rPr>
+      </w:pPr>
+    </w:p>
+    <w:p>
+      <w:pPr>
+        <w:rPr>
+          <w:rFonts w:ascii="宋体" w:eastAsia="宋体" w:hAnsi="宋体"/>
+          <w:b/>
+          <w:sz w:val="27"/>
+        </w:rPr>
+      </w:pPr>
+      <w:r>
+        <w:rPr>
+          <w:rFonts w:ascii="宋体" w:eastAsia="宋体" w:hAnsi="宋体"/>
+          <w:b/>
+          <w:sz w:val="27"/>
         </w:rPr>
         <w:t>1. 动机</w:t>
       </w:r>
@@ -103,13 +103,13 @@
       <w:pPr>
         <w:rPr>
           <w:rFonts w:ascii="宋体" w:eastAsia="宋体" w:hAnsi="宋体"/>
-          <w:sz w:val="23"/>
-        </w:rPr>
-      </w:pPr>
-      <w:r>
-        <w:rPr>
-          <w:rFonts w:ascii="宋体" w:eastAsia="宋体" w:hAnsi="宋体"/>
-          <w:sz w:val="23"/>
+          <w:sz w:val="22"/>
+        </w:rPr>
+      </w:pPr>
+      <w:r>
+        <w:rPr>
+          <w:rFonts w:ascii="宋体" w:eastAsia="宋体" w:hAnsi="宋体"/>
+          <w:sz w:val="22"/>
         </w:rPr>
         <w:t>• TGN 教师精度高，但推理依赖 memory、时间注意力与邻居采样，延迟/内存大、难部署；MLP 无图依赖、推理快，但缺结构与时序信息、精度低。故用知识蒸馏把教师知识转给轻量学生，兼顾精度与可部署性。</w:t>
       </w:r>
@@ -118,13 +118,13 @@
       <w:pPr>
         <w:rPr>
           <w:rFonts w:ascii="宋体" w:eastAsia="宋体" w:hAnsi="宋体"/>
-          <w:sz w:val="23"/>
-        </w:rPr>
-      </w:pPr>
-      <w:r>
-        <w:rPr>
-          <w:rFonts w:ascii="宋体" w:eastAsia="宋体" w:hAnsi="宋体"/>
-          <w:sz w:val="23"/>
+          <w:sz w:val="22"/>
+        </w:rPr>
+      </w:pPr>
+      <w:r>
+        <w:rPr>
+          <w:rFonts w:ascii="宋体" w:eastAsia="宋体" w:hAnsi="宋体"/>
+          <w:sz w:val="22"/>
         </w:rPr>
         <w:t>• 部署目标：希望学生具备「图无关」（推理不需要访问图/邻居）与「低延迟」特性，从而适配延迟敏感场景。</w:t>
       </w:r>
@@ -133,13 +133,13 @@
       <w:pPr>
         <w:rPr>
           <w:rFonts w:ascii="宋体" w:eastAsia="宋体" w:hAnsi="宋体"/>
-          <w:sz w:val="23"/>
-        </w:rPr>
-      </w:pPr>
-      <w:r>
-        <w:rPr>
-          <w:rFonts w:ascii="宋体" w:eastAsia="宋体" w:hAnsi="宋体"/>
-          <w:sz w:val="23"/>
+          <w:sz w:val="22"/>
+        </w:rPr>
+      </w:pPr>
+      <w:r>
+        <w:rPr>
+          <w:rFonts w:ascii="宋体" w:eastAsia="宋体" w:hAnsi="宋体"/>
+          <w:sz w:val="22"/>
         </w:rPr>
         <w:t>• 为何用最优传输（OT）：教师关系信息是「变长历史 token 轨迹」，学生是「固定关系槽」，二者不等长、无配对，逐元素 MSE/余弦无法对齐；Gromov-Wasserstein 类 OT 可同时对齐特征与关系结构，故提出 CUT-FGW（非平衡时序 Fused GW）。</w:t>
       </w:r>
@@ -148,13 +148,13 @@
       <w:pPr>
         <w:rPr>
           <w:rFonts w:ascii="宋体" w:eastAsia="宋体" w:hAnsi="宋体"/>
-          <w:sz w:val="23"/>
-        </w:rPr>
-      </w:pPr>
-      <w:r>
-        <w:rPr>
-          <w:rFonts w:ascii="宋体" w:eastAsia="宋体" w:hAnsi="宋体"/>
-          <w:sz w:val="23"/>
+          <w:sz w:val="22"/>
+        </w:rPr>
+      </w:pPr>
+      <w:r>
+        <w:rPr>
+          <w:rFonts w:ascii="宋体" w:eastAsia="宋体" w:hAnsi="宋体"/>
+          <w:sz w:val="22"/>
         </w:rPr>
         <w:t>• 核心问题：OT 是否为有效的蒸馏目标？对「图无关 MLP」还是「结构化学生」更有效？</w:t>
       </w:r>
@@ -163,23 +163,23 @@
       <w:pPr>
         <w:rPr>
           <w:rFonts w:ascii="宋体" w:eastAsia="宋体" w:hAnsi="宋体"/>
-          <w:sz w:val="23"/>
-        </w:rPr>
-      </w:pPr>
-    </w:p>
-    <w:p>
-      <w:pPr>
-        <w:rPr>
-          <w:rFonts w:ascii="宋体" w:eastAsia="宋体" w:hAnsi="宋体"/>
-          <w:b/>
-          <w:sz w:val="28"/>
-        </w:rPr>
-      </w:pPr>
-      <w:r>
-        <w:rPr>
-          <w:rFonts w:ascii="宋体" w:eastAsia="宋体" w:hAnsi="宋体"/>
-          <w:b/>
-          <w:sz w:val="28"/>
+          <w:sz w:val="22"/>
+        </w:rPr>
+      </w:pPr>
+    </w:p>
+    <w:p>
+      <w:pPr>
+        <w:rPr>
+          <w:rFonts w:ascii="宋体" w:eastAsia="宋体" w:hAnsi="宋体"/>
+          <w:b/>
+          <w:sz w:val="27"/>
+        </w:rPr>
+      </w:pPr>
+      <w:r>
+        <w:rPr>
+          <w:rFonts w:ascii="宋体" w:eastAsia="宋体" w:hAnsi="宋体"/>
+          <w:b/>
+          <w:sz w:val="27"/>
         </w:rPr>
         <w:t>2. 方法</w:t>
       </w:r>
@@ -205,13 +205,13 @@
       <w:pPr>
         <w:rPr>
           <w:rFonts w:ascii="宋体" w:eastAsia="宋体" w:hAnsi="宋体"/>
-          <w:sz w:val="23"/>
-        </w:rPr>
-      </w:pPr>
-      <w:r>
-        <w:rPr>
-          <w:rFonts w:ascii="宋体" w:eastAsia="宋体" w:hAnsi="宋体"/>
-          <w:sz w:val="23"/>
+          <w:sz w:val="22"/>
+        </w:rPr>
+      </w:pPr>
+      <w:r>
+        <w:rPr>
+          <w:rFonts w:ascii="宋体" w:eastAsia="宋体" w:hAnsi="宋体"/>
+          <w:sz w:val="22"/>
         </w:rPr>
         <w:t>• 教师 PyGTGNTeacher：TGNMemory + TransformerConv 时间图注意力 + LinkPredictor + relation_projector（另有固定 relation_align_head，仅作自监督对齐、不进入打分路径）。</w:t>
       </w:r>
@@ -220,13 +220,13 @@
       <w:pPr>
         <w:rPr>
           <w:rFonts w:ascii="宋体" w:eastAsia="宋体" w:hAnsi="宋体"/>
-          <w:sz w:val="23"/>
-        </w:rPr>
-      </w:pPr>
-      <w:r>
-        <w:rPr>
-          <w:rFonts w:ascii="宋体" w:eastAsia="宋体" w:hAnsi="宋体"/>
-          <w:sz w:val="23"/>
+          <w:sz w:val="22"/>
+        </w:rPr>
+      </w:pPr>
+      <w:r>
+        <w:rPr>
+          <w:rFonts w:ascii="宋体" w:eastAsia="宋体" w:hAnsi="宋体"/>
+          <w:sz w:val="22"/>
         </w:rPr>
         <w:t>• 学生：LightSTMLPStudent（图无关，仅读节点特征/ID/时间，含固定关系槽）；LightGNNStudent（1 层邻居 mean-pooling，作消融/上界）。</w:t>
       </w:r>
@@ -252,13 +252,13 @@
       <w:pPr>
         <w:rPr>
           <w:rFonts w:ascii="宋体" w:eastAsia="宋体" w:hAnsi="宋体"/>
-          <w:sz w:val="23"/>
-        </w:rPr>
-      </w:pPr>
-      <w:r>
-        <w:rPr>
-          <w:rFonts w:ascii="宋体" w:eastAsia="宋体" w:hAnsi="宋体"/>
-          <w:sz w:val="23"/>
+          <w:sz w:val="22"/>
+        </w:rPr>
+      </w:pPr>
+      <w:r>
+        <w:rPr>
+          <w:rFonts w:ascii="宋体" w:eastAsia="宋体" w:hAnsi="宋体"/>
+          <w:sz w:val="22"/>
         </w:rPr>
         <w:t>• basic(5)：出度/入度/活跃度/首末出现位置；rich(12)：再加唯一邻居、二跳、互惠、PageRank、近期活跃度、位置 std；nbr/nbr2/nbr3：basic + 1/2/3 跳邻居特征均值（SGC/GLNN 式预计算聚合）。</w:t>
       </w:r>
@@ -284,111 +284,111 @@
       <w:pPr>
         <w:rPr>
           <w:rFonts w:ascii="Consolas" w:eastAsia="宋体" w:hAnsi="Consolas" w:hint="eastAsia"/>
-          <w:sz w:val="19"/>
-        </w:rPr>
-      </w:pPr>
-      <w:r>
-        <w:rPr>
-          <w:rFonts w:ascii="Consolas" w:eastAsia="宋体" w:hAnsi="Consolas" w:hint="eastAsia"/>
-          <w:sz w:val="19"/>
+          <w:sz w:val="18"/>
+        </w:rPr>
+      </w:pPr>
+      <w:r>
+        <w:rPr>
+          <w:rFonts w:ascii="Consolas" w:eastAsia="宋体" w:hAnsi="Consolas" w:hint="eastAsia"/>
+          <w:sz w:val="18"/>
         </w:rPr>
         <w:t>L = w_task</w:t>
       </w:r>
       <w:r>
         <w:rPr>
           <w:rFonts w:ascii="Consolas" w:eastAsia="宋体" w:hAnsi="Consolas" w:hint="eastAsia"/>
-          <w:sz w:val="19"/>
+          <w:sz w:val="18"/>
         </w:rPr>
         <w:t>·</w:t>
       </w:r>
       <w:r>
         <w:rPr>
           <w:rFonts w:ascii="Consolas" w:eastAsia="宋体" w:hAnsi="Consolas" w:hint="eastAsia"/>
-          <w:sz w:val="19"/>
+          <w:sz w:val="18"/>
         </w:rPr>
         <w:t>CE + w_logit</w:t>
       </w:r>
       <w:r>
         <w:rPr>
           <w:rFonts w:ascii="Consolas" w:eastAsia="宋体" w:hAnsi="Consolas" w:hint="eastAsia"/>
-          <w:sz w:val="19"/>
+          <w:sz w:val="18"/>
         </w:rPr>
         <w:t>·</w:t>
       </w:r>
       <w:r>
         <w:rPr>
           <w:rFonts w:ascii="Consolas" w:eastAsia="宋体" w:hAnsi="Consolas" w:hint="eastAsia"/>
-          <w:sz w:val="19"/>
+          <w:sz w:val="18"/>
         </w:rPr>
         <w:t>KL + w_rank</w:t>
       </w:r>
       <w:r>
         <w:rPr>
           <w:rFonts w:ascii="Consolas" w:eastAsia="宋体" w:hAnsi="Consolas" w:hint="eastAsia"/>
-          <w:sz w:val="19"/>
+          <w:sz w:val="18"/>
         </w:rPr>
         <w:t>·</w:t>
       </w:r>
       <w:r>
         <w:rPr>
           <w:rFonts w:ascii="Consolas" w:eastAsia="宋体" w:hAnsi="Consolas" w:hint="eastAsia"/>
-          <w:sz w:val="19"/>
+          <w:sz w:val="18"/>
         </w:rPr>
         <w:t>W1 + w_anchor</w:t>
       </w:r>
       <w:r>
         <w:rPr>
           <w:rFonts w:ascii="Consolas" w:eastAsia="宋体" w:hAnsi="Consolas" w:hint="eastAsia"/>
-          <w:sz w:val="19"/>
+          <w:sz w:val="18"/>
         </w:rPr>
         <w:t>·</w:t>
       </w:r>
       <w:r>
         <w:rPr>
           <w:rFonts w:ascii="Consolas" w:eastAsia="宋体" w:hAnsi="Consolas" w:hint="eastAsia"/>
-          <w:sz w:val="19"/>
+          <w:sz w:val="18"/>
         </w:rPr>
         <w:t>anchor + w_relation</w:t>
       </w:r>
       <w:r>
         <w:rPr>
           <w:rFonts w:ascii="Consolas" w:eastAsia="宋体" w:hAnsi="Consolas" w:hint="eastAsia"/>
-          <w:sz w:val="19"/>
+          <w:sz w:val="18"/>
         </w:rPr>
         <w:t>·</w:t>
       </w:r>
       <w:r>
         <w:rPr>
           <w:rFonts w:ascii="Consolas" w:eastAsia="宋体" w:hAnsi="Consolas" w:hint="eastAsia"/>
-          <w:sz w:val="19"/>
+          <w:sz w:val="18"/>
         </w:rPr>
         <w:t>OT + w_div</w:t>
       </w:r>
       <w:r>
         <w:rPr>
           <w:rFonts w:ascii="Consolas" w:eastAsia="宋体" w:hAnsi="Consolas" w:hint="eastAsia"/>
-          <w:sz w:val="19"/>
+          <w:sz w:val="18"/>
         </w:rPr>
         <w:t>·</w:t>
       </w:r>
       <w:r>
         <w:rPr>
           <w:rFonts w:ascii="Consolas" w:eastAsia="宋体" w:hAnsi="Consolas" w:hint="eastAsia"/>
-          <w:sz w:val="19"/>
+          <w:sz w:val="18"/>
         </w:rPr>
         <w:t>div + w_embed</w:t>
       </w:r>
       <w:r>
         <w:rPr>
           <w:rFonts w:ascii="Consolas" w:eastAsia="宋体" w:hAnsi="Consolas" w:hint="eastAsia"/>
-          <w:sz w:val="19"/>
+          <w:sz w:val="18"/>
         </w:rPr>
         <w:t>·</w:t>
       </w:r>
       <w:r>
         <w:rPr>
           <w:rFonts w:ascii="Consolas" w:eastAsia="宋体" w:hAnsi="Consolas" w:hint="eastAsia"/>
-          <w:sz w:val="19"/>
+          <w:sz w:val="18"/>
         </w:rPr>
         <w:t>embed</w:t>
       </w:r>
@@ -397,13 +397,13 @@
       <w:pPr>
         <w:rPr>
           <w:rFonts w:ascii="宋体" w:eastAsia="宋体" w:hAnsi="宋体"/>
-          <w:sz w:val="23"/>
-        </w:rPr>
-      </w:pPr>
-      <w:r>
-        <w:rPr>
-          <w:rFonts w:ascii="宋体" w:eastAsia="宋体" w:hAnsi="宋体"/>
-          <w:sz w:val="23"/>
+          <w:sz w:val="22"/>
+        </w:rPr>
+      </w:pPr>
+      <w:r>
+        <w:rPr>
+          <w:rFonts w:ascii="宋体" w:eastAsia="宋体" w:hAnsi="宋体"/>
+          <w:sz w:val="22"/>
         </w:rPr>
         <w:t>• 各信号含义：logit=候选预测分布（KL）；rank=候选排序结构（Wasserstein-1）；anchor=按年龄锚定的关系表示对齐；relation=关系轨迹的结构最优传输（CUT-FGW）；diversity=关系槽多样性正则；embed=学生投影表示与教师上下文嵌入的特征级对齐。</w:t>
       </w:r>
@@ -412,13 +412,13 @@
       <w:pPr>
         <w:rPr>
           <w:rFonts w:ascii="宋体" w:eastAsia="宋体" w:hAnsi="宋体"/>
-          <w:sz w:val="23"/>
-        </w:rPr>
-      </w:pPr>
-      <w:r>
-        <w:rPr>
-          <w:rFonts w:ascii="宋体" w:eastAsia="宋体" w:hAnsi="宋体"/>
-          <w:sz w:val="23"/>
+          <w:sz w:val="22"/>
+        </w:rPr>
+      </w:pPr>
+      <w:r>
+        <w:rPr>
+          <w:rFonts w:ascii="宋体" w:eastAsia="宋体" w:hAnsi="宋体"/>
+          <w:sz w:val="22"/>
         </w:rPr>
         <w:t>• CUT-FGW：代价 = fused_alpha·属性代价(年龄) + (1-fused_alpha)·结构代价；结构代价 = memory_weight·(token 两两关系矩阵) + dynamics_weight·(相邻 token 差分)。用非平衡 Sinkhorn 在 FGW 近端迭代中更新传输 plan，以适配不等长集合。</w:t>
       </w:r>
@@ -427,13 +427,13 @@
       <w:pPr>
         <w:rPr>
           <w:rFonts w:ascii="宋体" w:eastAsia="宋体" w:hAnsi="宋体"/>
-          <w:sz w:val="23"/>
-        </w:rPr>
-      </w:pPr>
-      <w:r>
-        <w:rPr>
-          <w:rFonts w:ascii="宋体" w:eastAsia="宋体" w:hAnsi="宋体"/>
-          <w:sz w:val="23"/>
+          <w:sz w:val="22"/>
+        </w:rPr>
+      </w:pPr>
+      <w:r>
+        <w:rPr>
+          <w:rFonts w:ascii="宋体" w:eastAsia="宋体" w:hAnsi="宋体"/>
+          <w:sz w:val="22"/>
         </w:rPr>
         <w:t>• 关键修正：anchor 年龄需逐样本重标定到 [0,1]，否则所有学生槽会塌缩到同一教师 token（匹配退化为常数）。</w:t>
       </w:r>
@@ -459,13 +459,13 @@
       <w:pPr>
         <w:rPr>
           <w:rFonts w:ascii="宋体" w:eastAsia="宋体" w:hAnsi="宋体"/>
-          <w:sz w:val="23"/>
-        </w:rPr>
-      </w:pPr>
-      <w:r>
-        <w:rPr>
-          <w:rFonts w:ascii="宋体" w:eastAsia="宋体" w:hAnsi="宋体"/>
-          <w:sz w:val="23"/>
+          <w:sz w:val="22"/>
+        </w:rPr>
+      </w:pPr>
+      <w:r>
+        <w:rPr>
+          <w:rFonts w:ascii="宋体" w:eastAsia="宋体" w:hAnsi="宋体"/>
+          <w:sz w:val="22"/>
         </w:rPr>
         <w:t>• 官方 TGB MRR（时间划分与负采样协议不变）；官方评测由「逐事件」改为「每批 16 事件」前向（已验证与逐事件数值一致，约 2× 提速）；--dropout 0.3 用于降方差。</w:t>
       </w:r>
@@ -474,23 +474,23 @@
       <w:pPr>
         <w:rPr>
           <w:rFonts w:ascii="宋体" w:eastAsia="宋体" w:hAnsi="宋体"/>
-          <w:sz w:val="23"/>
-        </w:rPr>
-      </w:pPr>
-    </w:p>
-    <w:p>
-      <w:pPr>
-        <w:rPr>
-          <w:rFonts w:ascii="宋体" w:eastAsia="宋体" w:hAnsi="宋体"/>
-          <w:b/>
-          <w:sz w:val="28"/>
-        </w:rPr>
-      </w:pPr>
-      <w:r>
-        <w:rPr>
-          <w:rFonts w:ascii="宋体" w:eastAsia="宋体" w:hAnsi="宋体"/>
-          <w:b/>
-          <w:sz w:val="28"/>
+          <w:sz w:val="22"/>
+        </w:rPr>
+      </w:pPr>
+    </w:p>
+    <w:p>
+      <w:pPr>
+        <w:rPr>
+          <w:rFonts w:ascii="宋体" w:eastAsia="宋体" w:hAnsi="宋体"/>
+          <w:b/>
+          <w:sz w:val="27"/>
+        </w:rPr>
+      </w:pPr>
+      <w:r>
+        <w:rPr>
+          <w:rFonts w:ascii="宋体" w:eastAsia="宋体" w:hAnsi="宋体"/>
+          <w:b/>
+          <w:sz w:val="27"/>
         </w:rPr>
         <w:t>3. 实验</w:t>
       </w:r>
@@ -499,13 +499,13 @@
       <w:pPr>
         <w:rPr>
           <w:rFonts w:ascii="宋体" w:eastAsia="宋体" w:hAnsi="宋体"/>
-          <w:sz w:val="23"/>
-        </w:rPr>
-      </w:pPr>
-      <w:r>
-        <w:rPr>
-          <w:rFonts w:ascii="宋体" w:eastAsia="宋体" w:hAnsi="宋体"/>
-          <w:sz w:val="23"/>
+          <w:sz w:val="22"/>
+        </w:rPr>
+      </w:pPr>
+      <w:r>
+        <w:rPr>
+          <w:rFonts w:ascii="宋体" w:eastAsia="宋体" w:hAnsi="宋体"/>
+          <w:sz w:val="22"/>
         </w:rPr>
         <w:t>• 设置：tgbl-wiki；教师 test MRR=0.6806（冻结）；学生 20 epochs；指标 = 官方 test MRR。</w:t>
       </w:r>
@@ -531,13 +531,13 @@
       <w:pPr>
         <w:rPr>
           <w:rFonts w:ascii="Consolas" w:eastAsia="宋体" w:hAnsi="Consolas" w:hint="eastAsia"/>
-          <w:sz w:val="19"/>
-        </w:rPr>
-      </w:pPr>
-      <w:r>
-        <w:rPr>
-          <w:rFonts w:ascii="Consolas" w:eastAsia="宋体" w:hAnsi="Consolas" w:hint="eastAsia"/>
-          <w:sz w:val="19"/>
+          <w:sz w:val="18"/>
+        </w:rPr>
+      </w:pPr>
+      <w:r>
+        <w:rPr>
+          <w:rFonts w:ascii="Consolas" w:eastAsia="宋体" w:hAnsi="Consolas" w:hint="eastAsia"/>
+          <w:sz w:val="18"/>
         </w:rPr>
         <w:t>dropout 0.1 : mean 0.4279, std 0.0248    |    dropout 0.3 : mean 0.4423, std 0.0014</w:t>
       </w:r>
@@ -546,13 +546,13 @@
       <w:pPr>
         <w:rPr>
           <w:rFonts w:ascii="宋体" w:eastAsia="宋体" w:hAnsi="宋体"/>
-          <w:sz w:val="23"/>
-        </w:rPr>
-      </w:pPr>
-      <w:r>
-        <w:rPr>
-          <w:rFonts w:ascii="宋体" w:eastAsia="宋体" w:hAnsi="宋体"/>
-          <w:sz w:val="23"/>
+          <w:sz w:val="22"/>
+        </w:rPr>
+      </w:pPr>
+      <w:r>
+        <w:rPr>
+          <w:rFonts w:ascii="宋体" w:eastAsia="宋体" w:hAnsi="宋体"/>
+          <w:sz w:val="22"/>
         </w:rPr>
         <w:t>• dropout 0.3 同时提升均值并把方差降约 18 倍；此前一切「看似有效」的结论多为 seed 噪声。</w:t>
       </w:r>
@@ -561,13 +561,13 @@
       <w:pPr>
         <w:rPr>
           <w:rFonts w:ascii="宋体" w:eastAsia="宋体" w:hAnsi="宋体"/>
-          <w:sz w:val="23"/>
-        </w:rPr>
-      </w:pPr>
-      <w:r>
-        <w:rPr>
-          <w:rFonts w:ascii="宋体" w:eastAsia="宋体" w:hAnsi="宋体"/>
-          <w:sz w:val="23"/>
+          <w:sz w:val="22"/>
+        </w:rPr>
+      </w:pPr>
+      <w:r>
+        <w:rPr>
+          <w:rFonts w:ascii="宋体" w:eastAsia="宋体" w:hAnsi="宋体"/>
+          <w:sz w:val="22"/>
         </w:rPr>
         <w:t>• 失败尝试：dropout=0 崩到 0.34–0.38；EMA 无改善；低 LR/强 weight-decay 更差。</w:t>
       </w:r>
@@ -593,41 +593,41 @@
       <w:pPr>
         <w:rPr>
           <w:rFonts w:ascii="Consolas" w:eastAsia="宋体" w:hAnsi="Consolas" w:hint="eastAsia"/>
-          <w:sz w:val="19"/>
-        </w:rPr>
-      </w:pPr>
-      <w:r>
-        <w:rPr>
-          <w:rFonts w:ascii="Consolas" w:eastAsia="宋体" w:hAnsi="Consolas" w:hint="eastAsia"/>
-          <w:sz w:val="19"/>
+          <w:sz w:val="18"/>
+        </w:rPr>
+      </w:pPr>
+      <w:r>
+        <w:rPr>
+          <w:rFonts w:ascii="Consolas" w:eastAsia="宋体" w:hAnsi="Consolas" w:hint="eastAsia"/>
+          <w:sz w:val="18"/>
         </w:rPr>
         <w:t>对比</w:t>
       </w:r>
       <w:r>
         <w:rPr>
           <w:rFonts w:ascii="Consolas" w:eastAsia="宋体" w:hAnsi="Consolas" w:hint="eastAsia"/>
-          <w:sz w:val="19"/>
+          <w:sz w:val="18"/>
         </w:rPr>
         <w:t xml:space="preserve">                        | </w:t>
       </w:r>
       <w:r>
         <w:rPr>
           <w:rFonts w:ascii="Consolas" w:eastAsia="宋体" w:hAnsi="Consolas" w:hint="eastAsia"/>
-          <w:sz w:val="19"/>
+          <w:sz w:val="18"/>
         </w:rPr>
         <w:t>效应</w:t>
       </w:r>
       <w:r>
         <w:rPr>
           <w:rFonts w:ascii="Consolas" w:eastAsia="宋体" w:hAnsi="Consolas" w:hint="eastAsia"/>
-          <w:sz w:val="19"/>
+          <w:sz w:val="18"/>
         </w:rPr>
         <w:t xml:space="preserve">    | </w:t>
       </w:r>
       <w:r>
         <w:rPr>
           <w:rFonts w:ascii="Consolas" w:eastAsia="宋体" w:hAnsi="Consolas" w:hint="eastAsia"/>
-          <w:sz w:val="19"/>
+          <w:sz w:val="18"/>
         </w:rPr>
         <w:t>判定</w:t>
       </w:r>
@@ -636,27 +636,27 @@
       <w:pPr>
         <w:rPr>
           <w:rFonts w:ascii="Consolas" w:eastAsia="宋体" w:hAnsi="Consolas" w:hint="eastAsia"/>
-          <w:sz w:val="19"/>
-        </w:rPr>
-      </w:pPr>
-      <w:r>
-        <w:rPr>
-          <w:rFonts w:ascii="Consolas" w:eastAsia="宋体" w:hAnsi="Consolas" w:hint="eastAsia"/>
-          <w:sz w:val="19"/>
+          <w:sz w:val="18"/>
+        </w:rPr>
+      </w:pPr>
+      <w:r>
+        <w:rPr>
+          <w:rFonts w:ascii="Consolas" w:eastAsia="宋体" w:hAnsi="Consolas" w:hint="eastAsia"/>
+          <w:sz w:val="18"/>
         </w:rPr>
         <w:t>结构</w:t>
       </w:r>
       <w:r>
         <w:rPr>
           <w:rFonts w:ascii="Consolas" w:eastAsia="宋体" w:hAnsi="Consolas" w:hint="eastAsia"/>
-          <w:sz w:val="19"/>
+          <w:sz w:val="18"/>
         </w:rPr>
         <w:t xml:space="preserve"> GNN vs MLP (sup)       | +0.027  | </w:t>
       </w:r>
       <w:r>
         <w:rPr>
           <w:rFonts w:ascii="Consolas" w:eastAsia="宋体" w:hAnsi="Consolas" w:hint="eastAsia"/>
-          <w:sz w:val="19"/>
+          <w:sz w:val="18"/>
         </w:rPr>
         <w:t>大且稳定</w:t>
       </w:r>
@@ -665,34 +665,34 @@
       <w:pPr>
         <w:rPr>
           <w:rFonts w:ascii="Consolas" w:eastAsia="宋体" w:hAnsi="Consolas" w:hint="eastAsia"/>
-          <w:sz w:val="19"/>
-        </w:rPr>
-      </w:pPr>
-      <w:r>
-        <w:rPr>
-          <w:rFonts w:ascii="Consolas" w:eastAsia="宋体" w:hAnsi="Consolas" w:hint="eastAsia"/>
-          <w:sz w:val="19"/>
+          <w:sz w:val="18"/>
+        </w:rPr>
+      </w:pPr>
+      <w:r>
+        <w:rPr>
+          <w:rFonts w:ascii="Consolas" w:eastAsia="宋体" w:hAnsi="Consolas" w:hint="eastAsia"/>
+          <w:sz w:val="18"/>
         </w:rPr>
         <w:t xml:space="preserve">MLP </w:t>
       </w:r>
       <w:r>
         <w:rPr>
           <w:rFonts w:ascii="Consolas" w:eastAsia="宋体" w:hAnsi="Consolas" w:hint="eastAsia"/>
-          <w:sz w:val="19"/>
+          <w:sz w:val="18"/>
         </w:rPr>
         <w:t>特征</w:t>
       </w:r>
       <w:r>
         <w:rPr>
           <w:rFonts w:ascii="Consolas" w:eastAsia="宋体" w:hAnsi="Consolas" w:hint="eastAsia"/>
-          <w:sz w:val="19"/>
+          <w:sz w:val="18"/>
         </w:rPr>
         <w:t xml:space="preserve"> nbr2 vs basic      | -0.003  | </w:t>
       </w:r>
       <w:r>
         <w:rPr>
           <w:rFonts w:ascii="Consolas" w:eastAsia="宋体" w:hAnsi="Consolas" w:hint="eastAsia"/>
-          <w:sz w:val="19"/>
+          <w:sz w:val="18"/>
         </w:rPr>
         <w:t>无差异</w:t>
       </w:r>
@@ -701,34 +701,34 @@
       <w:pPr>
         <w:rPr>
           <w:rFonts w:ascii="Consolas" w:eastAsia="宋体" w:hAnsi="Consolas" w:hint="eastAsia"/>
-          <w:sz w:val="19"/>
-        </w:rPr>
-      </w:pPr>
-      <w:r>
-        <w:rPr>
-          <w:rFonts w:ascii="Consolas" w:eastAsia="宋体" w:hAnsi="Consolas" w:hint="eastAsia"/>
-          <w:sz w:val="19"/>
+          <w:sz w:val="18"/>
+        </w:rPr>
+      </w:pPr>
+      <w:r>
+        <w:rPr>
+          <w:rFonts w:ascii="Consolas" w:eastAsia="宋体" w:hAnsi="Consolas" w:hint="eastAsia"/>
+          <w:sz w:val="18"/>
         </w:rPr>
         <w:t xml:space="preserve">MLP(nbr2) </w:t>
       </w:r>
       <w:r>
         <w:rPr>
           <w:rFonts w:ascii="Consolas" w:eastAsia="宋体" w:hAnsi="Consolas" w:hint="eastAsia"/>
-          <w:sz w:val="19"/>
+          <w:sz w:val="18"/>
         </w:rPr>
         <w:t>蒸馏</w:t>
       </w:r>
       <w:r>
         <w:rPr>
           <w:rFonts w:ascii="Consolas" w:eastAsia="宋体" w:hAnsi="Consolas" w:hint="eastAsia"/>
-          <w:sz w:val="19"/>
+          <w:sz w:val="18"/>
         </w:rPr>
         <w:t xml:space="preserve"> vs sup       | +0.002  | </w:t>
       </w:r>
       <w:r>
         <w:rPr>
           <w:rFonts w:ascii="Consolas" w:eastAsia="宋体" w:hAnsi="Consolas" w:hint="eastAsia"/>
-          <w:sz w:val="19"/>
+          <w:sz w:val="18"/>
         </w:rPr>
         <w:t>不显著</w:t>
       </w:r>
@@ -737,34 +737,34 @@
       <w:pPr>
         <w:rPr>
           <w:rFonts w:ascii="Consolas" w:eastAsia="宋体" w:hAnsi="Consolas" w:hint="eastAsia"/>
-          <w:sz w:val="19"/>
-        </w:rPr>
-      </w:pPr>
-      <w:r>
-        <w:rPr>
-          <w:rFonts w:ascii="Consolas" w:eastAsia="宋体" w:hAnsi="Consolas" w:hint="eastAsia"/>
-          <w:sz w:val="19"/>
+          <w:sz w:val="18"/>
+        </w:rPr>
+      </w:pPr>
+      <w:r>
+        <w:rPr>
+          <w:rFonts w:ascii="Consolas" w:eastAsia="宋体" w:hAnsi="Consolas" w:hint="eastAsia"/>
+          <w:sz w:val="18"/>
         </w:rPr>
         <w:t xml:space="preserve">MLP(basic) </w:t>
       </w:r>
       <w:r>
         <w:rPr>
           <w:rFonts w:ascii="Consolas" w:eastAsia="宋体" w:hAnsi="Consolas" w:hint="eastAsia"/>
-          <w:sz w:val="19"/>
+          <w:sz w:val="18"/>
         </w:rPr>
         <w:t>蒸馏</w:t>
       </w:r>
       <w:r>
         <w:rPr>
           <w:rFonts w:ascii="Consolas" w:eastAsia="宋体" w:hAnsi="Consolas" w:hint="eastAsia"/>
-          <w:sz w:val="19"/>
+          <w:sz w:val="18"/>
         </w:rPr>
         <w:t xml:space="preserve"> vs sup      | -0.009  | </w:t>
       </w:r>
       <w:r>
         <w:rPr>
           <w:rFonts w:ascii="Consolas" w:eastAsia="宋体" w:hAnsi="Consolas" w:hint="eastAsia"/>
-          <w:sz w:val="19"/>
+          <w:sz w:val="18"/>
         </w:rPr>
         <w:t>显著为负</w:t>
       </w:r>
@@ -773,34 +773,34 @@
       <w:pPr>
         <w:rPr>
           <w:rFonts w:ascii="Consolas" w:eastAsia="宋体" w:hAnsi="Consolas" w:hint="eastAsia"/>
-          <w:sz w:val="19"/>
-        </w:rPr>
-      </w:pPr>
-      <w:r>
-        <w:rPr>
-          <w:rFonts w:ascii="Consolas" w:eastAsia="宋体" w:hAnsi="Consolas" w:hint="eastAsia"/>
-          <w:sz w:val="19"/>
+          <w:sz w:val="18"/>
+        </w:rPr>
+      </w:pPr>
+      <w:r>
+        <w:rPr>
+          <w:rFonts w:ascii="Consolas" w:eastAsia="宋体" w:hAnsi="Consolas" w:hint="eastAsia"/>
+          <w:sz w:val="18"/>
         </w:rPr>
         <w:t xml:space="preserve">GNN </w:t>
       </w:r>
       <w:r>
         <w:rPr>
           <w:rFonts w:ascii="Consolas" w:eastAsia="宋体" w:hAnsi="Consolas" w:hint="eastAsia"/>
-          <w:sz w:val="19"/>
+          <w:sz w:val="18"/>
         </w:rPr>
         <w:t>蒸馏</w:t>
       </w:r>
       <w:r>
         <w:rPr>
           <w:rFonts w:ascii="Consolas" w:eastAsia="宋体" w:hAnsi="Consolas" w:hint="eastAsia"/>
-          <w:sz w:val="19"/>
-        </w:rPr>
-        <w:t xml:space="preserve"> vs sup             | +0.006  | </w:t>
-      </w:r>
-      <w:r>
-        <w:rPr>
-          <w:rFonts w:ascii="Consolas" w:eastAsia="宋体" w:hAnsi="Consolas" w:hint="eastAsia"/>
-          <w:sz w:val="19"/>
+          <w:sz w:val="18"/>
+        </w:rPr>
+        <w:t xml:space="preserve"> rel=1.0 vs sup     | +0.006  | </w:t>
+      </w:r>
+      <w:r>
+        <w:rPr>
+          <w:rFonts w:ascii="Consolas" w:eastAsia="宋体" w:hAnsi="Consolas" w:hint="eastAsia"/>
+          <w:sz w:val="18"/>
         </w:rPr>
         <w:t>不显著</w:t>
       </w:r>
@@ -808,6 +808,92 @@
     <w:p>
       <w:pPr>
         <w:rPr>
+          <w:rFonts w:ascii="Consolas" w:eastAsia="宋体" w:hAnsi="Consolas" w:hint="eastAsia"/>
+          <w:sz w:val="18"/>
+        </w:rPr>
+      </w:pPr>
+      <w:r>
+        <w:rPr>
+          <w:rFonts w:ascii="Consolas" w:eastAsia="宋体" w:hAnsi="Consolas" w:hint="eastAsia"/>
+          <w:sz w:val="18"/>
+        </w:rPr>
+        <w:t xml:space="preserve">GNN OT rel=0.5 vs sup      | +0.025  | </w:t>
+      </w:r>
+      <w:r>
+        <w:rPr>
+          <w:rFonts w:ascii="Consolas" w:eastAsia="宋体" w:hAnsi="Consolas" w:hint="eastAsia"/>
+          <w:sz w:val="18"/>
+        </w:rPr>
+        <w:t>显著</w:t>
+      </w:r>
+      <w:r>
+        <w:rPr>
+          <w:rFonts w:ascii="Consolas" w:eastAsia="宋体" w:hAnsi="Consolas" w:hint="eastAsia"/>
+          <w:sz w:val="18"/>
+        </w:rPr>
+        <w:t xml:space="preserve"> (t</w:t>
+      </w:r>
+      <w:r>
+        <w:rPr>
+          <w:rFonts w:ascii="Consolas" w:eastAsia="宋体" w:hAnsi="Consolas" w:hint="eastAsia"/>
+          <w:sz w:val="18"/>
+        </w:rPr>
+        <w:t>≈</w:t>
+      </w:r>
+      <w:r>
+        <w:rPr>
+          <w:rFonts w:ascii="Consolas" w:eastAsia="宋体" w:hAnsi="Consolas" w:hint="eastAsia"/>
+          <w:sz w:val="18"/>
+        </w:rPr>
+        <w:t>5.0)</w:t>
+      </w:r>
+    </w:p>
+    <w:p>
+      <w:pPr>
+        <w:rPr>
+          <w:rFonts w:ascii="Consolas" w:eastAsia="宋体" w:hAnsi="Consolas" w:hint="eastAsia"/>
+          <w:sz w:val="18"/>
+        </w:rPr>
+      </w:pPr>
+      <w:r>
+        <w:rPr>
+          <w:rFonts w:ascii="Consolas" w:eastAsia="宋体" w:hAnsi="Consolas" w:hint="eastAsia"/>
+          <w:sz w:val="18"/>
+        </w:rPr>
+        <w:t xml:space="preserve">GNN OT fa=0.5 vs sup       | +0.022  | </w:t>
+      </w:r>
+      <w:r>
+        <w:rPr>
+          <w:rFonts w:ascii="Consolas" w:eastAsia="宋体" w:hAnsi="Consolas" w:hint="eastAsia"/>
+          <w:sz w:val="18"/>
+        </w:rPr>
+        <w:t>显著</w:t>
+      </w:r>
+      <w:r>
+        <w:rPr>
+          <w:rFonts w:ascii="Consolas" w:eastAsia="宋体" w:hAnsi="Consolas" w:hint="eastAsia"/>
+          <w:sz w:val="18"/>
+        </w:rPr>
+        <w:t xml:space="preserve"> (t</w:t>
+      </w:r>
+      <w:r>
+        <w:rPr>
+          <w:rFonts w:ascii="Consolas" w:eastAsia="宋体" w:hAnsi="Consolas" w:hint="eastAsia"/>
+          <w:sz w:val="18"/>
+        </w:rPr>
+        <w:t>≈</w:t>
+      </w:r>
+      <w:r>
+        <w:rPr>
+          <w:rFonts w:ascii="Consolas" w:eastAsia="宋体" w:hAnsi="Consolas" w:hint="eastAsia"/>
+          <w:sz w:val="18"/>
+        </w:rPr>
+        <w:t>5.8)</w:t>
+      </w:r>
+    </w:p>
+    <w:p>
+      <w:pPr>
+        <w:rPr>
           <w:rFonts w:ascii="宋体" w:eastAsia="宋体" w:hAnsi="宋体"/>
           <w:b/>
           <w:sz w:val="24"/>
@@ -826,13 +912,13 @@
       <w:pPr>
         <w:rPr>
           <w:rFonts w:ascii="宋体" w:eastAsia="宋体" w:hAnsi="宋体"/>
-          <w:sz w:val="23"/>
-        </w:rPr>
-      </w:pPr>
-      <w:r>
-        <w:rPr>
-          <w:rFonts w:ascii="宋体" w:eastAsia="宋体" w:hAnsi="宋体"/>
-          <w:sz w:val="23"/>
+          <w:sz w:val="22"/>
+        </w:rPr>
+      </w:pPr>
+      <w:r>
+        <w:rPr>
+          <w:rFonts w:ascii="宋体" w:eastAsia="宋体" w:hAnsi="宋体"/>
+          <w:sz w:val="22"/>
         </w:rPr>
         <w:t>• --ot-fast（fgw 4→2、sinkhorn 20→8）约 4× 提速，精度基本持平；OT 计算约占额外 73 ms/batch。</w:t>
       </w:r>
@@ -841,13 +927,13 @@
       <w:pPr>
         <w:rPr>
           <w:rFonts w:ascii="宋体" w:eastAsia="宋体" w:hAnsi="宋体"/>
-          <w:sz w:val="23"/>
-        </w:rPr>
-      </w:pPr>
-      <w:r>
-        <w:rPr>
-          <w:rFonts w:ascii="宋体" w:eastAsia="宋体" w:hAnsi="宋体"/>
-          <w:sz w:val="23"/>
+          <w:sz w:val="22"/>
+        </w:rPr>
+      </w:pPr>
+      <w:r>
+        <w:rPr>
+          <w:rFonts w:ascii="宋体" w:eastAsia="宋体" w:hAnsi="宋体"/>
+          <w:sz w:val="22"/>
         </w:rPr>
         <w:t>• anchor 对 MLP 有害；嵌入级蒸馏直接对齐共享表示会崩溃（0.128），改为独立投影头 + 小权重后修复、但无增益（0.4410）。</w:t>
       </w:r>
@@ -856,13 +942,13 @@
       <w:pPr>
         <w:rPr>
           <w:rFonts w:ascii="宋体" w:eastAsia="宋体" w:hAnsi="宋体"/>
-          <w:sz w:val="23"/>
-        </w:rPr>
-      </w:pPr>
-      <w:r>
-        <w:rPr>
-          <w:rFonts w:ascii="宋体" w:eastAsia="宋体" w:hAnsi="宋体"/>
-          <w:sz w:val="23"/>
+          <w:sz w:val="22"/>
+        </w:rPr>
+      </w:pPr>
+      <w:r>
+        <w:rPr>
+          <w:rFonts w:ascii="宋体" w:eastAsia="宋体" w:hAnsi="宋体"/>
+          <w:sz w:val="22"/>
         </w:rPr>
         <w:t>• 多跳邻居聚合：nbr2（2 跳）在单 seed 下看似最优（0.4538），但有功效协议下与 basic 无显著差异。</w:t>
       </w:r>
@@ -888,68 +974,83 @@
       <w:pPr>
         <w:rPr>
           <w:rFonts w:ascii="宋体" w:eastAsia="宋体" w:hAnsi="宋体"/>
-          <w:sz w:val="23"/>
-        </w:rPr>
-      </w:pPr>
-      <w:r>
-        <w:rPr>
-          <w:rFonts w:ascii="宋体" w:eastAsia="宋体" w:hAnsi="宋体"/>
-          <w:sz w:val="23"/>
-        </w:rPr>
-        <w:t>• 唯一稳健的大效应是「结构」：1 层 GNN 学生比图无关 MLP 高约 +0.027。</w:t>
-      </w:r>
-    </w:p>
-    <w:p>
-      <w:pPr>
-        <w:rPr>
-          <w:rFonts w:ascii="宋体" w:eastAsia="宋体" w:hAnsi="宋体"/>
-          <w:sz w:val="23"/>
-        </w:rPr>
-      </w:pPr>
-      <w:r>
-        <w:rPr>
-          <w:rFonts w:ascii="宋体" w:eastAsia="宋体" w:hAnsi="宋体"/>
-          <w:sz w:val="23"/>
-        </w:rPr>
-        <w:t>• 邻域特征对图无关 MLP 无可靠增益；OT 及各蒸馏变体（关系 token、anchor、diversity、嵌入级）均无可靠增益（对弱学生甚至有害）。</w:t>
-      </w:r>
-    </w:p>
-    <w:p>
-      <w:pPr>
-        <w:rPr>
-          <w:rFonts w:ascii="宋体" w:eastAsia="宋体" w:hAnsi="宋体"/>
-          <w:sz w:val="23"/>
-        </w:rPr>
-      </w:pPr>
-      <w:r>
-        <w:rPr>
-          <w:rFonts w:ascii="宋体" w:eastAsia="宋体" w:hAnsi="宋体"/>
-          <w:sz w:val="23"/>
-        </w:rPr>
-        <w:t>• 图无关 MLP 天花板约 0.44–0.45（GNN 约 0.47，教师 0.68）。教训：~0.01 量级结论必须配对多 seed，并先降方差。</w:t>
-      </w:r>
-    </w:p>
-    <w:p>
-      <w:pPr>
-        <w:rPr>
-          <w:rFonts w:ascii="宋体" w:eastAsia="宋体" w:hAnsi="宋体"/>
-          <w:sz w:val="23"/>
-        </w:rPr>
-      </w:pPr>
-    </w:p>
-    <w:p>
-      <w:pPr>
-        <w:rPr>
-          <w:rFonts w:ascii="宋体" w:eastAsia="宋体" w:hAnsi="宋体"/>
-          <w:b/>
-          <w:sz w:val="28"/>
-        </w:rPr>
-      </w:pPr>
-      <w:r>
-        <w:rPr>
-          <w:rFonts w:ascii="宋体" w:eastAsia="宋体" w:hAnsi="宋体"/>
-          <w:b/>
-          <w:sz w:val="28"/>
+          <w:sz w:val="22"/>
+        </w:rPr>
+      </w:pPr>
+      <w:r>
+        <w:rPr>
+          <w:rFonts w:ascii="宋体" w:eastAsia="宋体" w:hAnsi="宋体"/>
+          <w:sz w:val="22"/>
+        </w:rPr>
+        <w:t>• 结构是稳健的大效应：1 层 GNN 学生比图无关 MLP 高约 +0.027。</w:t>
+      </w:r>
+    </w:p>
+    <w:p>
+      <w:pPr>
+        <w:rPr>
+          <w:rFonts w:ascii="宋体" w:eastAsia="宋体" w:hAnsi="宋体"/>
+          <w:sz w:val="22"/>
+        </w:rPr>
+      </w:pPr>
+      <w:r>
+        <w:rPr>
+          <w:rFonts w:ascii="宋体" w:eastAsia="宋体" w:hAnsi="宋体"/>
+          <w:sz w:val="22"/>
+        </w:rPr>
+        <w:t>• OT（CUT-FGW）在结构化 GNN 学生上显著有效：relation_weight=0.5 或 fused_alpha=0.5 → 相对监督 +0.022~0.025（t≈5~5.8）；此前 +0.006 不显著是因 OT 权重过大（rel=1.0）。</w:t>
+      </w:r>
+    </w:p>
+    <w:p>
+      <w:pPr>
+        <w:rPr>
+          <w:rFonts w:ascii="宋体" w:eastAsia="宋体" w:hAnsi="宋体"/>
+          <w:sz w:val="22"/>
+        </w:rPr>
+      </w:pPr>
+      <w:r>
+        <w:rPr>
+          <w:rFonts w:ascii="宋体" w:eastAsia="宋体" w:hAnsi="宋体"/>
+          <w:sz w:val="22"/>
+        </w:rPr>
+        <w:t>• 图无关 MLP 上 OT/邻域特征无可靠增益（弱特征时蒸馏甚至显著为负）；MLP 天花板约 0.44–0.45。</w:t>
+      </w:r>
+    </w:p>
+    <w:p>
+      <w:pPr>
+        <w:rPr>
+          <w:rFonts w:ascii="宋体" w:eastAsia="宋体" w:hAnsi="宋体"/>
+          <w:sz w:val="22"/>
+        </w:rPr>
+      </w:pPr>
+      <w:r>
+        <w:rPr>
+          <w:rFonts w:ascii="宋体" w:eastAsia="宋体" w:hAnsi="宋体"/>
+          <w:sz w:val="22"/>
+        </w:rPr>
+        <w:t>• 教训：~0.01 量级结论必须配对多 seed，并先用 dropout 0.3 降方差。</w:t>
+      </w:r>
+    </w:p>
+    <w:p>
+      <w:pPr>
+        <w:rPr>
+          <w:rFonts w:ascii="宋体" w:eastAsia="宋体" w:hAnsi="宋体"/>
+          <w:sz w:val="22"/>
+        </w:rPr>
+      </w:pPr>
+    </w:p>
+    <w:p>
+      <w:pPr>
+        <w:rPr>
+          <w:rFonts w:ascii="宋体" w:eastAsia="宋体" w:hAnsi="宋体"/>
+          <w:b/>
+          <w:sz w:val="27"/>
+        </w:rPr>
+      </w:pPr>
+      <w:r>
+        <w:rPr>
+          <w:rFonts w:ascii="宋体" w:eastAsia="宋体" w:hAnsi="宋体"/>
+          <w:b/>
+          <w:sz w:val="27"/>
         </w:rPr>
         <w:t>4. 参考论文</w:t>
       </w:r>
@@ -958,13 +1059,13 @@
       <w:pPr>
         <w:rPr>
           <w:rFonts w:ascii="宋体" w:eastAsia="宋体" w:hAnsi="宋体"/>
-          <w:sz w:val="23"/>
-        </w:rPr>
-      </w:pPr>
-      <w:r>
-        <w:rPr>
-          <w:rFonts w:ascii="宋体" w:eastAsia="宋体" w:hAnsi="宋体"/>
-          <w:sz w:val="23"/>
+          <w:sz w:val="22"/>
+        </w:rPr>
+      </w:pPr>
+      <w:r>
+        <w:rPr>
+          <w:rFonts w:ascii="宋体" w:eastAsia="宋体" w:hAnsi="宋体"/>
+          <w:sz w:val="22"/>
         </w:rPr>
         <w:t>• 时序/基准：TGN arXiv:2006.10637；TGB arXiv:2307.01026。</w:t>
       </w:r>
@@ -973,13 +1074,13 @@
       <w:pPr>
         <w:rPr>
           <w:rFonts w:ascii="宋体" w:eastAsia="宋体" w:hAnsi="宋体"/>
-          <w:sz w:val="23"/>
-        </w:rPr>
-      </w:pPr>
-      <w:r>
-        <w:rPr>
-          <w:rFonts w:ascii="宋体" w:eastAsia="宋体" w:hAnsi="宋体"/>
-          <w:sz w:val="23"/>
+          <w:sz w:val="22"/>
+        </w:rPr>
+      </w:pPr>
+      <w:r>
+        <w:rPr>
+          <w:rFonts w:ascii="宋体" w:eastAsia="宋体" w:hAnsi="宋体"/>
+          <w:sz w:val="22"/>
         </w:rPr>
         <w:t>• 图→MLP 蒸馏：GLNN 2110.08727；LLP 2210.05801；P&amp;D 2311.11759；PGKD 2303.13763；InfGraND 2601.08033；L-STEP 2506.08309。</w:t>
       </w:r>
@@ -988,13 +1089,13 @@
       <w:pPr>
         <w:rPr>
           <w:rFonts w:ascii="宋体" w:eastAsia="宋体" w:hAnsi="宋体"/>
-          <w:sz w:val="23"/>
-        </w:rPr>
-      </w:pPr>
-      <w:r>
-        <w:rPr>
-          <w:rFonts w:ascii="宋体" w:eastAsia="宋体" w:hAnsi="宋体"/>
-          <w:sz w:val="23"/>
+          <w:sz w:val="22"/>
+        </w:rPr>
+      </w:pPr>
+      <w:r>
+        <w:rPr>
+          <w:rFonts w:ascii="宋体" w:eastAsia="宋体" w:hAnsi="宋体"/>
+          <w:sz w:val="22"/>
         </w:rPr>
         <w:t>• 最优传输：FGW 1805.09114；FGW 理论 1811.02834；GW（Peyré 等, ICML 2016）；Sinkhorn（Cuturi, NIPS 2013）；非平衡 OT 1607.05816。</w:t>
       </w:r>
@@ -1003,13 +1104,13 @@
       <w:pPr>
         <w:rPr>
           <w:rFonts w:ascii="宋体" w:eastAsia="宋体" w:hAnsi="宋体"/>
-          <w:sz w:val="23"/>
-        </w:rPr>
-      </w:pPr>
-      <w:r>
-        <w:rPr>
-          <w:rFonts w:ascii="宋体" w:eastAsia="宋体" w:hAnsi="宋体"/>
-          <w:sz w:val="23"/>
+          <w:sz w:val="22"/>
+        </w:rPr>
+      </w:pPr>
+      <w:r>
+        <w:rPr>
+          <w:rFonts w:ascii="宋体" w:eastAsia="宋体" w:hAnsi="宋体"/>
+          <w:sz w:val="22"/>
         </w:rPr>
         <w:t>• 蒸馏/基础：KD 1503.02531；FitNet 1412.6550；SGC 1902.07153。</w:t>
       </w:r>
@@ -1018,23 +1119,23 @@
       <w:pPr>
         <w:rPr>
           <w:rFonts w:ascii="宋体" w:eastAsia="宋体" w:hAnsi="宋体"/>
-          <w:sz w:val="23"/>
-        </w:rPr>
-      </w:pPr>
-    </w:p>
-    <w:p>
-      <w:pPr>
-        <w:rPr>
-          <w:rFonts w:ascii="宋体" w:eastAsia="宋体" w:hAnsi="宋体"/>
-          <w:b/>
-          <w:sz w:val="28"/>
-        </w:rPr>
-      </w:pPr>
-      <w:r>
-        <w:rPr>
-          <w:rFonts w:ascii="宋体" w:eastAsia="宋体" w:hAnsi="宋体"/>
-          <w:b/>
-          <w:sz w:val="28"/>
+          <w:sz w:val="22"/>
+        </w:rPr>
+      </w:pPr>
+    </w:p>
+    <w:p>
+      <w:pPr>
+        <w:rPr>
+          <w:rFonts w:ascii="宋体" w:eastAsia="宋体" w:hAnsi="宋体"/>
+          <w:b/>
+          <w:sz w:val="27"/>
+        </w:rPr>
+      </w:pPr>
+      <w:r>
+        <w:rPr>
+          <w:rFonts w:ascii="宋体" w:eastAsia="宋体" w:hAnsi="宋体"/>
+          <w:b/>
+          <w:sz w:val="27"/>
         </w:rPr>
         <w:t>5. 可复现实验清单</w:t>
       </w:r>
@@ -1043,13 +1144,13 @@
       <w:pPr>
         <w:rPr>
           <w:rFonts w:ascii="宋体" w:eastAsia="宋体" w:hAnsi="宋体"/>
-          <w:sz w:val="23"/>
-        </w:rPr>
-      </w:pPr>
-      <w:r>
-        <w:rPr>
-          <w:rFonts w:ascii="宋体" w:eastAsia="宋体" w:hAnsi="宋体"/>
-          <w:sz w:val="23"/>
+          <w:sz w:val="22"/>
+        </w:rPr>
+      </w:pPr>
+      <w:r>
+        <w:rPr>
+          <w:rFonts w:ascii="宋体" w:eastAsia="宋体" w:hAnsi="宋体"/>
+          <w:sz w:val="22"/>
         </w:rPr>
         <w:t>• 关键默认：--dataset tgbl-wiki --teacher-checkpoint checkpoints/wiki-tgn/teacher.pt --method anchor_ot --student-arch mlp --structure-feature-set nbr2 --dropout 0.3 --student-epochs 20 --patience 5 --ot-fast --logit-weight 0.5 --rank-weight 0.5 --relation-weight 1.0 --diversity-weight 0.01 --anchor-weight 0.0；配对 --student-seed 42/43/44；正式报告用全量 val（去掉 --eval-max-events）。</w:t>
       </w:r>
@@ -1058,28 +1159,43 @@
       <w:pPr>
         <w:rPr>
           <w:rFonts w:ascii="宋体" w:eastAsia="宋体" w:hAnsi="宋体"/>
-          <w:sz w:val="23"/>
-        </w:rPr>
-      </w:pPr>
-      <w:r>
-        <w:rPr>
-          <w:rFonts w:ascii="宋体" w:eastAsia="宋体" w:hAnsi="宋体"/>
-          <w:sz w:val="23"/>
-        </w:rPr>
-        <w:t>• 脚本：train-tgn.sh、train-mlp-struct.sh、train-mlp-kd.sh、run-ablation-mlp.sh、run-ot-abl.sh、run-hop.sh、run-kd-abl.sh、run-final.sh、run-stable.sh、run-d03.sh、run-basicd03.sh、run-gnn.sh、run-embed.sh。</w:t>
-      </w:r>
-    </w:p>
-    <w:p>
-      <w:pPr>
-        <w:rPr>
-          <w:rFonts w:ascii="宋体" w:eastAsia="宋体" w:hAnsi="宋体"/>
-          <w:sz w:val="23"/>
-        </w:rPr>
-      </w:pPr>
-      <w:r>
-        <w:rPr>
-          <w:rFonts w:ascii="宋体" w:eastAsia="宋体" w:hAnsi="宋体"/>
-          <w:sz w:val="23"/>
+          <w:sz w:val="22"/>
+        </w:rPr>
+      </w:pPr>
+      <w:r>
+        <w:rPr>
+          <w:rFonts w:ascii="宋体" w:eastAsia="宋体" w:hAnsi="宋体"/>
+          <w:sz w:val="22"/>
+        </w:rPr>
+        <w:t>• GNN 显著配方：--student-arch gnn --student-neighbors 8 --dropout 0.3 --relation-weight 0.5 --diversity-weight 0.01 --logit-weight 0.5 --rank-weight 0.5 --fused-alpha 0.20 --ot-fast（或 --relation-weight 1.0 --fused-alpha 0.5）。</w:t>
+      </w:r>
+    </w:p>
+    <w:p>
+      <w:pPr>
+        <w:rPr>
+          <w:rFonts w:ascii="宋体" w:eastAsia="宋体" w:hAnsi="宋体"/>
+          <w:sz w:val="22"/>
+        </w:rPr>
+      </w:pPr>
+      <w:r>
+        <w:rPr>
+          <w:rFonts w:ascii="宋体" w:eastAsia="宋体" w:hAnsi="宋体"/>
+          <w:sz w:val="22"/>
+        </w:rPr>
+        <w:t>• 脚本：train-tgn.sh、train-mlp-struct.sh、train-mlp-kd.sh、run-ablation-mlp.sh、run-ot-abl.sh、run-hop.sh、run-kd-abl.sh、run-final.sh、run-stable.sh、run-d03.sh、run-basicd03.sh、run-gnn.sh、run-gnntune.sh、run-gnnconf.sh、run-embed.sh。</w:t>
+      </w:r>
+    </w:p>
+    <w:p>
+      <w:pPr>
+        <w:rPr>
+          <w:rFonts w:ascii="宋体" w:eastAsia="宋体" w:hAnsi="宋体"/>
+          <w:sz w:val="22"/>
+        </w:rPr>
+      </w:pPr>
+      <w:r>
+        <w:rPr>
+          <w:rFonts w:ascii="宋体" w:eastAsia="宋体" w:hAnsi="宋体"/>
+          <w:sz w:val="22"/>
         </w:rPr>
         <w:t>• 结果：服务器 experiments/&lt;批次&gt;/&lt;配置&gt;.log；汇总见 RESULTS.md（表 1–17）。</w:t>
       </w:r>
@@ -1088,13 +1204,13 @@
       <w:pPr>
         <w:rPr>
           <w:rFonts w:ascii="宋体" w:eastAsia="宋体" w:hAnsi="宋体"/>
-          <w:sz w:val="23"/>
-        </w:rPr>
-      </w:pPr>
-      <w:r>
-        <w:rPr>
-          <w:rFonts w:ascii="宋体" w:eastAsia="宋体" w:hAnsi="宋体"/>
-          <w:sz w:val="23"/>
+          <w:sz w:val="22"/>
+        </w:rPr>
+      </w:pPr>
+      <w:r>
+        <w:rPr>
+          <w:rFonts w:ascii="宋体" w:eastAsia="宋体" w:hAnsi="宋体"/>
+          <w:sz w:val="22"/>
         </w:rPr>
         <w:t>• 工程要点（已落地）：批量官方评测（等价、约 2× 提速）；--ot-fast；--ema-decay；年龄逐样本归一化修复；教师固定带关系头；nbr 特征广播修复。</w:t>
       </w:r>
@@ -1103,7 +1219,7 @@
       <w:pPr>
         <w:rPr>
           <w:rFonts w:ascii="宋体" w:eastAsia="宋体" w:hAnsi="宋体"/>
-          <w:sz w:val="23"/>
+          <w:sz w:val="22"/>
         </w:rPr>
       </w:pPr>
     </w:p>
@@ -1524,7 +1640,7 @@
     <w:link w:val="10"/>
     <w:uiPriority w:val="9"/>
     <w:qFormat/>
-    <w:rsid w:val="005D7050"/>
+    <w:rsid w:val="00F870F4"/>
     <w:pPr>
       <w:keepNext/>
       <w:keepLines/>
@@ -1547,7 +1663,7 @@
     <w:semiHidden/>
     <w:unhideWhenUsed/>
     <w:qFormat/>
-    <w:rsid w:val="005D7050"/>
+    <w:rsid w:val="00F870F4"/>
     <w:pPr>
       <w:keepNext/>
       <w:keepLines/>
@@ -1570,7 +1686,7 @@
     <w:semiHidden/>
     <w:unhideWhenUsed/>
     <w:qFormat/>
-    <w:rsid w:val="005D7050"/>
+    <w:rsid w:val="00F870F4"/>
     <w:pPr>
       <w:keepNext/>
       <w:keepLines/>
@@ -1593,7 +1709,7 @@
     <w:semiHidden/>
     <w:unhideWhenUsed/>
     <w:qFormat/>
-    <w:rsid w:val="005D7050"/>
+    <w:rsid w:val="00F870F4"/>
     <w:pPr>
       <w:keepNext/>
       <w:keepLines/>
@@ -1616,7 +1732,7 @@
     <w:semiHidden/>
     <w:unhideWhenUsed/>
     <w:qFormat/>
-    <w:rsid w:val="005D7050"/>
+    <w:rsid w:val="00F870F4"/>
     <w:pPr>
       <w:keepNext/>
       <w:keepLines/>
@@ -1639,7 +1755,7 @@
     <w:semiHidden/>
     <w:unhideWhenUsed/>
     <w:qFormat/>
-    <w:rsid w:val="005D7050"/>
+    <w:rsid w:val="00F870F4"/>
     <w:pPr>
       <w:keepNext/>
       <w:keepLines/>
@@ -1662,7 +1778,7 @@
     <w:semiHidden/>
     <w:unhideWhenUsed/>
     <w:qFormat/>
-    <w:rsid w:val="005D7050"/>
+    <w:rsid w:val="00F870F4"/>
     <w:pPr>
       <w:keepNext/>
       <w:keepLines/>
@@ -1685,7 +1801,7 @@
     <w:semiHidden/>
     <w:unhideWhenUsed/>
     <w:qFormat/>
-    <w:rsid w:val="005D7050"/>
+    <w:rsid w:val="00F870F4"/>
     <w:pPr>
       <w:keepNext/>
       <w:keepLines/>
@@ -1705,7 +1821,7 @@
     <w:semiHidden/>
     <w:unhideWhenUsed/>
     <w:qFormat/>
-    <w:rsid w:val="005D7050"/>
+    <w:rsid w:val="00F870F4"/>
     <w:pPr>
       <w:keepNext/>
       <w:keepLines/>
@@ -1748,7 +1864,7 @@
     <w:basedOn w:val="a0"/>
     <w:link w:val="1"/>
     <w:uiPriority w:val="9"/>
-    <w:rsid w:val="005D7050"/>
+    <w:rsid w:val="00F870F4"/>
     <w:rPr>
       <w:rFonts w:asciiTheme="majorHAnsi" w:eastAsiaTheme="majorEastAsia" w:hAnsiTheme="majorHAnsi" w:cstheme="majorBidi"/>
       <w:color w:val="0F4761" w:themeColor="accent1" w:themeShade="BF"/>
@@ -1762,7 +1878,7 @@
     <w:link w:val="2"/>
     <w:uiPriority w:val="9"/>
     <w:semiHidden/>
-    <w:rsid w:val="005D7050"/>
+    <w:rsid w:val="00F870F4"/>
     <w:rPr>
       <w:rFonts w:asciiTheme="majorHAnsi" w:eastAsiaTheme="majorEastAsia" w:hAnsiTheme="majorHAnsi" w:cstheme="majorBidi"/>
       <w:color w:val="0F4761" w:themeColor="accent1" w:themeShade="BF"/>
@@ -1776,7 +1892,7 @@
     <w:link w:val="3"/>
     <w:uiPriority w:val="9"/>
     <w:semiHidden/>
-    <w:rsid w:val="005D7050"/>
+    <w:rsid w:val="00F870F4"/>
     <w:rPr>
       <w:rFonts w:asciiTheme="majorHAnsi" w:eastAsiaTheme="majorEastAsia" w:hAnsiTheme="majorHAnsi" w:cstheme="majorBidi"/>
       <w:color w:val="0F4761" w:themeColor="accent1" w:themeShade="BF"/>
@@ -1790,7 +1906,7 @@
     <w:link w:val="4"/>
     <w:uiPriority w:val="9"/>
     <w:semiHidden/>
-    <w:rsid w:val="005D7050"/>
+    <w:rsid w:val="00F870F4"/>
     <w:rPr>
       <w:rFonts w:cstheme="majorBidi"/>
       <w:color w:val="0F4761" w:themeColor="accent1" w:themeShade="BF"/>
@@ -1804,7 +1920,7 @@
     <w:link w:val="5"/>
     <w:uiPriority w:val="9"/>
     <w:semiHidden/>
-    <w:rsid w:val="005D7050"/>
+    <w:rsid w:val="00F870F4"/>
     <w:rPr>
       <w:rFonts w:cstheme="majorBidi"/>
       <w:color w:val="0F4761" w:themeColor="accent1" w:themeShade="BF"/>
@@ -1818,7 +1934,7 @@
     <w:link w:val="6"/>
     <w:uiPriority w:val="9"/>
     <w:semiHidden/>
-    <w:rsid w:val="005D7050"/>
+    <w:rsid w:val="00F870F4"/>
     <w:rPr>
       <w:rFonts w:cstheme="majorBidi"/>
       <w:b/>
@@ -1832,7 +1948,7 @@
     <w:link w:val="7"/>
     <w:uiPriority w:val="9"/>
     <w:semiHidden/>
-    <w:rsid w:val="005D7050"/>
+    <w:rsid w:val="00F870F4"/>
     <w:rPr>
       <w:rFonts w:cstheme="majorBidi"/>
       <w:b/>
@@ -1846,7 +1962,7 @@
     <w:link w:val="8"/>
     <w:uiPriority w:val="9"/>
     <w:semiHidden/>
-    <w:rsid w:val="005D7050"/>
+    <w:rsid w:val="00F870F4"/>
     <w:rPr>
       <w:rFonts w:cstheme="majorBidi"/>
       <w:color w:val="595959" w:themeColor="text1" w:themeTint="A6"/>
@@ -1858,7 +1974,7 @@
     <w:link w:val="9"/>
     <w:uiPriority w:val="9"/>
     <w:semiHidden/>
-    <w:rsid w:val="005D7050"/>
+    <w:rsid w:val="00F870F4"/>
     <w:rPr>
       <w:rFonts w:eastAsiaTheme="majorEastAsia" w:cstheme="majorBidi"/>
       <w:color w:val="595959" w:themeColor="text1" w:themeTint="A6"/>
@@ -1871,7 +1987,7 @@
     <w:link w:val="a4"/>
     <w:uiPriority w:val="10"/>
     <w:qFormat/>
-    <w:rsid w:val="005D7050"/>
+    <w:rsid w:val="00F870F4"/>
     <w:pPr>
       <w:spacing w:after="80"/>
       <w:contextualSpacing/>
@@ -1890,7 +2006,7 @@
     <w:basedOn w:val="a0"/>
     <w:link w:val="a3"/>
     <w:uiPriority w:val="10"/>
-    <w:rsid w:val="005D7050"/>
+    <w:rsid w:val="00F870F4"/>
     <w:rPr>
       <w:rFonts w:asciiTheme="majorHAnsi" w:eastAsiaTheme="majorEastAsia" w:hAnsiTheme="majorHAnsi" w:cstheme="majorBidi"/>
       <w:spacing w:val="-10"/>
@@ -1906,7 +2022,7 @@
     <w:link w:val="a6"/>
     <w:uiPriority w:val="11"/>
     <w:qFormat/>
-    <w:rsid w:val="005D7050"/>
+    <w:rsid w:val="00F870F4"/>
     <w:pPr>
       <w:numPr>
         <w:ilvl w:val="1"/>
@@ -1927,7 +2043,7 @@
     <w:basedOn w:val="a0"/>
     <w:link w:val="a5"/>
     <w:uiPriority w:val="11"/>
-    <w:rsid w:val="005D7050"/>
+    <w:rsid w:val="00F870F4"/>
     <w:rPr>
       <w:rFonts w:asciiTheme="majorHAnsi" w:eastAsiaTheme="majorEastAsia" w:hAnsiTheme="majorHAnsi" w:cstheme="majorBidi"/>
       <w:color w:val="595959" w:themeColor="text1" w:themeTint="A6"/>
@@ -1943,7 +2059,7 @@
     <w:link w:val="a8"/>
     <w:uiPriority w:val="29"/>
     <w:qFormat/>
-    <w:rsid w:val="005D7050"/>
+    <w:rsid w:val="00F870F4"/>
     <w:pPr>
       <w:spacing w:before="160" w:after="160"/>
       <w:jc w:val="center"/>
@@ -1959,7 +2075,7 @@
     <w:basedOn w:val="a0"/>
     <w:link w:val="a7"/>
     <w:uiPriority w:val="29"/>
-    <w:rsid w:val="005D7050"/>
+    <w:rsid w:val="00F870F4"/>
     <w:rPr>
       <w:i/>
       <w:iCs/>
@@ -1971,7 +2087,7 @@
     <w:basedOn w:val="a"/>
     <w:uiPriority w:val="34"/>
     <w:qFormat/>
-    <w:rsid w:val="005D7050"/>
+    <w:rsid w:val="00F870F4"/>
     <w:pPr>
       <w:ind w:left="720"/>
       <w:contextualSpacing/>
@@ -1982,7 +2098,7 @@
     <w:basedOn w:val="a0"/>
     <w:uiPriority w:val="21"/>
     <w:qFormat/>
-    <w:rsid w:val="005D7050"/>
+    <w:rsid w:val="00F870F4"/>
     <w:rPr>
       <w:i/>
       <w:iCs/>
@@ -1996,7 +2112,7 @@
     <w:link w:val="ac"/>
     <w:uiPriority w:val="30"/>
     <w:qFormat/>
-    <w:rsid w:val="005D7050"/>
+    <w:rsid w:val="00F870F4"/>
     <w:pPr>
       <w:pBdr>
         <w:top w:val="single" w:sz="4" w:space="10" w:color="0F4761" w:themeColor="accent1" w:themeShade="BF"/>
@@ -2017,7 +2133,7 @@
     <w:basedOn w:val="a0"/>
     <w:link w:val="ab"/>
     <w:uiPriority w:val="30"/>
-    <w:rsid w:val="005D7050"/>
+    <w:rsid w:val="00F870F4"/>
     <w:rPr>
       <w:i/>
       <w:iCs/>
@@ -2029,7 +2145,7 @@
     <w:basedOn w:val="a0"/>
     <w:uiPriority w:val="32"/>
     <w:qFormat/>
-    <w:rsid w:val="005D7050"/>
+    <w:rsid w:val="00F870F4"/>
     <w:rPr>
       <w:b/>
       <w:bCs/>

</xml_diff>

<commit_message>
docs: update 3-page report with n=6 GNN OT confirmation
</commit_message>
<xml_diff>
--- a/CUTFGWD_Report.docx
+++ b/CUTFGWD_Report.docx
@@ -71,7 +71,7 @@
           <w:rFonts w:ascii="宋体" w:eastAsia="宋体" w:hAnsi="宋体"/>
           <w:sz w:val="22"/>
         </w:rPr>
-        <w:t>本文档总结 CUTFGWD（时序图知识蒸馏）方法从代码审查、工程实现到系统实验的全过程，覆盖 17 张实验表。结论以「配对多 seed + 全量官方 val」为口径：先解决评测方差，再判断方法效应。</w:t>
+        <w:t>本文档总结 CUTFGWD（时序图知识蒸馏）方法从代码审查、工程实现到系统实验的全过程，覆盖 19 张实验表。结论以「配对多 seed + 全量官方 val」为口径：先解决评测方差，再判断方法效应。</w:t>
       </w:r>
     </w:p>
     <w:p>
@@ -586,7 +586,7 @@
           <w:b/>
           <w:sz w:val="24"/>
         </w:rPr>
-        <w:t>3.2 有功效协议下的对比（dropout 0.3，3 seed，全量 val）</w:t>
+        <w:t>3.2 有功效协议下的对比（dropout 0.3，全量 val）</w:t>
       </w:r>
     </w:p>
     <w:p>
@@ -651,7 +651,7 @@
           <w:rFonts w:ascii="Consolas" w:eastAsia="宋体" w:hAnsi="Consolas" w:hint="eastAsia"/>
           <w:sz w:val="18"/>
         </w:rPr>
-        <w:t xml:space="preserve"> GNN vs MLP (sup)       | +0.027  | </w:t>
+        <w:t xml:space="preserve"> GNN vs MLP (sup, n=3)  | +0.027  | </w:t>
       </w:r>
       <w:r>
         <w:rPr>
@@ -817,7 +817,7 @@
           <w:rFonts w:ascii="Consolas" w:eastAsia="宋体" w:hAnsi="Consolas" w:hint="eastAsia"/>
           <w:sz w:val="18"/>
         </w:rPr>
-        <w:t xml:space="preserve">GNN OT rel=0.5 vs sup      | +0.025  | </w:t>
+        <w:t xml:space="preserve">GNN OT rel=0.5 vs sup       | +0.020  | </w:t>
       </w:r>
       <w:r>
         <w:rPr>
@@ -845,22 +845,22 @@
           <w:rFonts w:ascii="Consolas" w:eastAsia="宋体" w:hAnsi="Consolas" w:hint="eastAsia"/>
           <w:sz w:val="18"/>
         </w:rPr>
-        <w:t>5.0)</w:t>
-      </w:r>
-    </w:p>
-    <w:p>
-      <w:pPr>
-        <w:rPr>
-          <w:rFonts w:ascii="Consolas" w:eastAsia="宋体" w:hAnsi="Consolas" w:hint="eastAsia"/>
-          <w:sz w:val="18"/>
-        </w:rPr>
-      </w:pPr>
-      <w:r>
-        <w:rPr>
-          <w:rFonts w:ascii="Consolas" w:eastAsia="宋体" w:hAnsi="Consolas" w:hint="eastAsia"/>
-          <w:sz w:val="18"/>
-        </w:rPr>
-        <w:t xml:space="preserve">GNN OT fa=0.5 vs sup       | +0.022  | </w:t>
+        <w:t>5.5, n=6)</w:t>
+      </w:r>
+    </w:p>
+    <w:p>
+      <w:pPr>
+        <w:rPr>
+          <w:rFonts w:ascii="Consolas" w:eastAsia="宋体" w:hAnsi="Consolas" w:hint="eastAsia"/>
+          <w:sz w:val="18"/>
+        </w:rPr>
+      </w:pPr>
+      <w:r>
+        <w:rPr>
+          <w:rFonts w:ascii="Consolas" w:eastAsia="宋体" w:hAnsi="Consolas" w:hint="eastAsia"/>
+          <w:sz w:val="18"/>
+        </w:rPr>
+        <w:t xml:space="preserve">GNN OT fa=0.5 vs sup        | +0.025  | </w:t>
       </w:r>
       <w:r>
         <w:rPr>
@@ -888,7 +888,7 @@
           <w:rFonts w:ascii="Consolas" w:eastAsia="宋体" w:hAnsi="Consolas" w:hint="eastAsia"/>
           <w:sz w:val="18"/>
         </w:rPr>
-        <w:t>5.8)</w:t>
+        <w:t>2.8, n=6)</w:t>
       </w:r>
     </w:p>
     <w:p>
@@ -997,7 +997,7 @@
           <w:rFonts w:ascii="宋体" w:eastAsia="宋体" w:hAnsi="宋体"/>
           <w:sz w:val="22"/>
         </w:rPr>
-        <w:t>• OT（CUT-FGW）在结构化 GNN 学生上显著有效：relation_weight=0.5 或 fused_alpha=0.5 → 相对监督 +0.022~0.025（t≈5~5.8）；此前 +0.006 不显著是因 OT 权重过大（rel=1.0）。</w:t>
+        <w:t>• OT（CUT-FGW）在结构化 GNN 学生上显著有效：relation_weight=0.5 或 fused_alpha=0.5 → 相对监督 +0.020~0.025（n=6，显著）；此前 +0.006 不显著是因 OT 权重过大（rel=1.0）。推荐 rel=0.5（更稳，+0.020, t≈5.5）。</w:t>
       </w:r>
     </w:p>
     <w:p>
@@ -1182,22 +1182,22 @@
           <w:rFonts w:ascii="宋体" w:eastAsia="宋体" w:hAnsi="宋体"/>
           <w:sz w:val="22"/>
         </w:rPr>
-        <w:t>• 脚本：train-tgn.sh、train-mlp-struct.sh、train-mlp-kd.sh、run-ablation-mlp.sh、run-ot-abl.sh、run-hop.sh、run-kd-abl.sh、run-final.sh、run-stable.sh、run-d03.sh、run-basicd03.sh、run-gnn.sh、run-gnntune.sh、run-gnnconf.sh、run-embed.sh。</w:t>
-      </w:r>
-    </w:p>
-    <w:p>
-      <w:pPr>
-        <w:rPr>
-          <w:rFonts w:ascii="宋体" w:eastAsia="宋体" w:hAnsi="宋体"/>
-          <w:sz w:val="22"/>
-        </w:rPr>
-      </w:pPr>
-      <w:r>
-        <w:rPr>
-          <w:rFonts w:ascii="宋体" w:eastAsia="宋体" w:hAnsi="宋体"/>
-          <w:sz w:val="22"/>
-        </w:rPr>
-        <w:t>• 结果：服务器 experiments/&lt;批次&gt;/&lt;配置&gt;.log；汇总见 RESULTS.md（表 1–17）。</w:t>
+        <w:t>• 脚本：train-tgn.sh、train-mlp-struct.sh、train-mlp-kd.sh、run-ablation-mlp.sh、run-ot-abl.sh、run-hop.sh、run-kd-abl.sh、run-final.sh、run-stable.sh、run-d03.sh、run-basicd03.sh、run-gnn.sh、run-gnntune.sh、run-gnnconf.sh、run-gnn6.sh、run-embed.sh。</w:t>
+      </w:r>
+    </w:p>
+    <w:p>
+      <w:pPr>
+        <w:rPr>
+          <w:rFonts w:ascii="宋体" w:eastAsia="宋体" w:hAnsi="宋体"/>
+          <w:sz w:val="22"/>
+        </w:rPr>
+      </w:pPr>
+      <w:r>
+        <w:rPr>
+          <w:rFonts w:ascii="宋体" w:eastAsia="宋体" w:hAnsi="宋体"/>
+          <w:sz w:val="22"/>
+        </w:rPr>
+        <w:t>• 结果：服务器 experiments/&lt;批次&gt;/&lt;配置&gt;.log；汇总见 RESULTS.md（表 1–19）。</w:t>
       </w:r>
     </w:p>
     <w:p>
@@ -1640,7 +1640,7 @@
     <w:link w:val="10"/>
     <w:uiPriority w:val="9"/>
     <w:qFormat/>
-    <w:rsid w:val="00F870F4"/>
+    <w:rsid w:val="0067128A"/>
     <w:pPr>
       <w:keepNext/>
       <w:keepLines/>
@@ -1663,7 +1663,7 @@
     <w:semiHidden/>
     <w:unhideWhenUsed/>
     <w:qFormat/>
-    <w:rsid w:val="00F870F4"/>
+    <w:rsid w:val="0067128A"/>
     <w:pPr>
       <w:keepNext/>
       <w:keepLines/>
@@ -1686,7 +1686,7 @@
     <w:semiHidden/>
     <w:unhideWhenUsed/>
     <w:qFormat/>
-    <w:rsid w:val="00F870F4"/>
+    <w:rsid w:val="0067128A"/>
     <w:pPr>
       <w:keepNext/>
       <w:keepLines/>
@@ -1709,7 +1709,7 @@
     <w:semiHidden/>
     <w:unhideWhenUsed/>
     <w:qFormat/>
-    <w:rsid w:val="00F870F4"/>
+    <w:rsid w:val="0067128A"/>
     <w:pPr>
       <w:keepNext/>
       <w:keepLines/>
@@ -1732,7 +1732,7 @@
     <w:semiHidden/>
     <w:unhideWhenUsed/>
     <w:qFormat/>
-    <w:rsid w:val="00F870F4"/>
+    <w:rsid w:val="0067128A"/>
     <w:pPr>
       <w:keepNext/>
       <w:keepLines/>
@@ -1755,7 +1755,7 @@
     <w:semiHidden/>
     <w:unhideWhenUsed/>
     <w:qFormat/>
-    <w:rsid w:val="00F870F4"/>
+    <w:rsid w:val="0067128A"/>
     <w:pPr>
       <w:keepNext/>
       <w:keepLines/>
@@ -1778,7 +1778,7 @@
     <w:semiHidden/>
     <w:unhideWhenUsed/>
     <w:qFormat/>
-    <w:rsid w:val="00F870F4"/>
+    <w:rsid w:val="0067128A"/>
     <w:pPr>
       <w:keepNext/>
       <w:keepLines/>
@@ -1801,7 +1801,7 @@
     <w:semiHidden/>
     <w:unhideWhenUsed/>
     <w:qFormat/>
-    <w:rsid w:val="00F870F4"/>
+    <w:rsid w:val="0067128A"/>
     <w:pPr>
       <w:keepNext/>
       <w:keepLines/>
@@ -1821,7 +1821,7 @@
     <w:semiHidden/>
     <w:unhideWhenUsed/>
     <w:qFormat/>
-    <w:rsid w:val="00F870F4"/>
+    <w:rsid w:val="0067128A"/>
     <w:pPr>
       <w:keepNext/>
       <w:keepLines/>
@@ -1864,7 +1864,7 @@
     <w:basedOn w:val="a0"/>
     <w:link w:val="1"/>
     <w:uiPriority w:val="9"/>
-    <w:rsid w:val="00F870F4"/>
+    <w:rsid w:val="0067128A"/>
     <w:rPr>
       <w:rFonts w:asciiTheme="majorHAnsi" w:eastAsiaTheme="majorEastAsia" w:hAnsiTheme="majorHAnsi" w:cstheme="majorBidi"/>
       <w:color w:val="0F4761" w:themeColor="accent1" w:themeShade="BF"/>
@@ -1878,7 +1878,7 @@
     <w:link w:val="2"/>
     <w:uiPriority w:val="9"/>
     <w:semiHidden/>
-    <w:rsid w:val="00F870F4"/>
+    <w:rsid w:val="0067128A"/>
     <w:rPr>
       <w:rFonts w:asciiTheme="majorHAnsi" w:eastAsiaTheme="majorEastAsia" w:hAnsiTheme="majorHAnsi" w:cstheme="majorBidi"/>
       <w:color w:val="0F4761" w:themeColor="accent1" w:themeShade="BF"/>
@@ -1892,7 +1892,7 @@
     <w:link w:val="3"/>
     <w:uiPriority w:val="9"/>
     <w:semiHidden/>
-    <w:rsid w:val="00F870F4"/>
+    <w:rsid w:val="0067128A"/>
     <w:rPr>
       <w:rFonts w:asciiTheme="majorHAnsi" w:eastAsiaTheme="majorEastAsia" w:hAnsiTheme="majorHAnsi" w:cstheme="majorBidi"/>
       <w:color w:val="0F4761" w:themeColor="accent1" w:themeShade="BF"/>
@@ -1906,7 +1906,7 @@
     <w:link w:val="4"/>
     <w:uiPriority w:val="9"/>
     <w:semiHidden/>
-    <w:rsid w:val="00F870F4"/>
+    <w:rsid w:val="0067128A"/>
     <w:rPr>
       <w:rFonts w:cstheme="majorBidi"/>
       <w:color w:val="0F4761" w:themeColor="accent1" w:themeShade="BF"/>
@@ -1920,7 +1920,7 @@
     <w:link w:val="5"/>
     <w:uiPriority w:val="9"/>
     <w:semiHidden/>
-    <w:rsid w:val="00F870F4"/>
+    <w:rsid w:val="0067128A"/>
     <w:rPr>
       <w:rFonts w:cstheme="majorBidi"/>
       <w:color w:val="0F4761" w:themeColor="accent1" w:themeShade="BF"/>
@@ -1934,7 +1934,7 @@
     <w:link w:val="6"/>
     <w:uiPriority w:val="9"/>
     <w:semiHidden/>
-    <w:rsid w:val="00F870F4"/>
+    <w:rsid w:val="0067128A"/>
     <w:rPr>
       <w:rFonts w:cstheme="majorBidi"/>
       <w:b/>
@@ -1948,7 +1948,7 @@
     <w:link w:val="7"/>
     <w:uiPriority w:val="9"/>
     <w:semiHidden/>
-    <w:rsid w:val="00F870F4"/>
+    <w:rsid w:val="0067128A"/>
     <w:rPr>
       <w:rFonts w:cstheme="majorBidi"/>
       <w:b/>
@@ -1962,7 +1962,7 @@
     <w:link w:val="8"/>
     <w:uiPriority w:val="9"/>
     <w:semiHidden/>
-    <w:rsid w:val="00F870F4"/>
+    <w:rsid w:val="0067128A"/>
     <w:rPr>
       <w:rFonts w:cstheme="majorBidi"/>
       <w:color w:val="595959" w:themeColor="text1" w:themeTint="A6"/>
@@ -1974,7 +1974,7 @@
     <w:link w:val="9"/>
     <w:uiPriority w:val="9"/>
     <w:semiHidden/>
-    <w:rsid w:val="00F870F4"/>
+    <w:rsid w:val="0067128A"/>
     <w:rPr>
       <w:rFonts w:eastAsiaTheme="majorEastAsia" w:cstheme="majorBidi"/>
       <w:color w:val="595959" w:themeColor="text1" w:themeTint="A6"/>
@@ -1987,7 +1987,7 @@
     <w:link w:val="a4"/>
     <w:uiPriority w:val="10"/>
     <w:qFormat/>
-    <w:rsid w:val="00F870F4"/>
+    <w:rsid w:val="0067128A"/>
     <w:pPr>
       <w:spacing w:after="80"/>
       <w:contextualSpacing/>
@@ -2006,7 +2006,7 @@
     <w:basedOn w:val="a0"/>
     <w:link w:val="a3"/>
     <w:uiPriority w:val="10"/>
-    <w:rsid w:val="00F870F4"/>
+    <w:rsid w:val="0067128A"/>
     <w:rPr>
       <w:rFonts w:asciiTheme="majorHAnsi" w:eastAsiaTheme="majorEastAsia" w:hAnsiTheme="majorHAnsi" w:cstheme="majorBidi"/>
       <w:spacing w:val="-10"/>
@@ -2022,7 +2022,7 @@
     <w:link w:val="a6"/>
     <w:uiPriority w:val="11"/>
     <w:qFormat/>
-    <w:rsid w:val="00F870F4"/>
+    <w:rsid w:val="0067128A"/>
     <w:pPr>
       <w:numPr>
         <w:ilvl w:val="1"/>
@@ -2043,7 +2043,7 @@
     <w:basedOn w:val="a0"/>
     <w:link w:val="a5"/>
     <w:uiPriority w:val="11"/>
-    <w:rsid w:val="00F870F4"/>
+    <w:rsid w:val="0067128A"/>
     <w:rPr>
       <w:rFonts w:asciiTheme="majorHAnsi" w:eastAsiaTheme="majorEastAsia" w:hAnsiTheme="majorHAnsi" w:cstheme="majorBidi"/>
       <w:color w:val="595959" w:themeColor="text1" w:themeTint="A6"/>
@@ -2059,7 +2059,7 @@
     <w:link w:val="a8"/>
     <w:uiPriority w:val="29"/>
     <w:qFormat/>
-    <w:rsid w:val="00F870F4"/>
+    <w:rsid w:val="0067128A"/>
     <w:pPr>
       <w:spacing w:before="160" w:after="160"/>
       <w:jc w:val="center"/>
@@ -2075,7 +2075,7 @@
     <w:basedOn w:val="a0"/>
     <w:link w:val="a7"/>
     <w:uiPriority w:val="29"/>
-    <w:rsid w:val="00F870F4"/>
+    <w:rsid w:val="0067128A"/>
     <w:rPr>
       <w:i/>
       <w:iCs/>
@@ -2087,7 +2087,7 @@
     <w:basedOn w:val="a"/>
     <w:uiPriority w:val="34"/>
     <w:qFormat/>
-    <w:rsid w:val="00F870F4"/>
+    <w:rsid w:val="0067128A"/>
     <w:pPr>
       <w:ind w:left="720"/>
       <w:contextualSpacing/>
@@ -2098,7 +2098,7 @@
     <w:basedOn w:val="a0"/>
     <w:uiPriority w:val="21"/>
     <w:qFormat/>
-    <w:rsid w:val="00F870F4"/>
+    <w:rsid w:val="0067128A"/>
     <w:rPr>
       <w:i/>
       <w:iCs/>
@@ -2112,7 +2112,7 @@
     <w:link w:val="ac"/>
     <w:uiPriority w:val="30"/>
     <w:qFormat/>
-    <w:rsid w:val="00F870F4"/>
+    <w:rsid w:val="0067128A"/>
     <w:pPr>
       <w:pBdr>
         <w:top w:val="single" w:sz="4" w:space="10" w:color="0F4761" w:themeColor="accent1" w:themeShade="BF"/>
@@ -2133,7 +2133,7 @@
     <w:basedOn w:val="a0"/>
     <w:link w:val="ab"/>
     <w:uiPriority w:val="30"/>
-    <w:rsid w:val="00F870F4"/>
+    <w:rsid w:val="0067128A"/>
     <w:rPr>
       <w:i/>
       <w:iCs/>
@@ -2145,7 +2145,7 @@
     <w:basedOn w:val="a0"/>
     <w:uiPriority w:val="32"/>
     <w:qFormat/>
-    <w:rsid w:val="00F870F4"/>
+    <w:rsid w:val="0067128A"/>
     <w:rPr>
       <w:b/>
       <w:bCs/>

</xml_diff>